<commit_message>
Actualiza manual y protege credencial de Scopus
</commit_message>
<xml_diff>
--- a/11_documentacion/Manual_Documentacion_Proyecto_Sirocco.docx
+++ b/11_documentacion/Manual_Documentacion_Proyecto_Sirocco.docx
@@ -10233,7 +10233,7 @@
     </w:p>
     <w:bookmarkEnd w:id="144"/>
     <w:bookmarkEnd w:id="145"/>
-    <w:bookmarkStart w:id="151" w:name="X55c9669f959b053b923ab5ba03ac577024581d8"/>
+    <w:bookmarkStart w:id="156" w:name="X55c9669f959b053b923ab5ba03ac577024581d8"/>
     <w:p>
       <w:pPr>
         <w:pStyle w:val="Heading1"/>
@@ -10275,13 +10275,13 @@
       </w:r>
     </w:p>
     <w:bookmarkEnd w:id="146"/>
-    <w:bookmarkStart w:id="148" w:name="archivo"/>
+    <w:bookmarkStart w:id="148" w:name="archivos-5"/>
     <w:p>
       <w:pPr>
         <w:pStyle w:val="Heading2"/>
       </w:pPr>
       <w:r>
-        <w:t xml:space="preserve">Archivo</w:t>
+        <w:t xml:space="preserve">Archivos</w:t>
       </w:r>
     </w:p>
     <w:bookmarkStart w:id="147" w:name="primer_trabajo_de_investigacion_u-1docx"/>
@@ -10324,7 +10324,7 @@
     </w:p>
     <w:bookmarkEnd w:id="147"/>
     <w:bookmarkEnd w:id="148"/>
-    <w:bookmarkStart w:id="149" w:name="cómo-revisarlo"/>
+    <w:bookmarkStart w:id="153" w:name="cómo-revisarlo"/>
     <w:p>
       <w:pPr>
         <w:pStyle w:val="Heading2"/>
@@ -10390,13 +10390,235 @@
         <w:t xml:space="preserve">del contenido técnico del proyecto.</w:t>
       </w:r>
     </w:p>
+    <w:bookmarkStart w:id="149" w:name="X79bef57d243b4282ed6131edd49275ef468b308"/>
+    <w:p>
+      <w:pPr>
+        <w:pStyle w:val="Heading3"/>
+      </w:pPr>
+      <w:r>
+        <w:rPr>
+          <w:rStyle w:val="VerbatimChar"/>
+        </w:rPr>
+        <w:t xml:space="preserve">articulo_gemelo_digital.tex</w:t>
+      </w:r>
+      <w:r>
+        <w:t xml:space="preserve"> </w:t>
+      </w:r>
+      <w:r>
+        <w:t xml:space="preserve">y</w:t>
+      </w:r>
+      <w:r>
+        <w:t xml:space="preserve"> </w:t>
+      </w:r>
+      <w:r>
+        <w:rPr>
+          <w:rStyle w:val="VerbatimChar"/>
+        </w:rPr>
+        <w:t xml:space="preserve">articulo_gemelo_digital.pdf</w:t>
+      </w:r>
+    </w:p>
+    <w:p>
+      <w:pPr>
+        <w:pStyle w:val="FirstParagraph"/>
+      </w:pPr>
+      <w:r>
+        <w:t xml:space="preserve">Artículo paralelo titulado "Implementación de un Gemelo Digital para la</w:t>
+      </w:r>
+      <w:r>
+        <w:t xml:space="preserve"> </w:t>
+      </w:r>
+      <w:r>
+        <w:t xml:space="preserve">Optimización Energética y Diagnóstico Operativo de una Bomba Centrífuga</w:t>
+      </w:r>
+      <w:r>
+        <w:t xml:space="preserve"> </w:t>
+      </w:r>
+      <w:r>
+        <w:t xml:space="preserve">Industrial". El PDF tiene 4 páginas y desarrolla arquitectura física, IoT,</w:t>
+      </w:r>
+      <w:r>
+        <w:t xml:space="preserve"> </w:t>
+      </w:r>
+      <w:r>
+        <w:t xml:space="preserve">modelo virtual, seguimiento del punto de mejor eficiencia y diagnóstico de</w:t>
+      </w:r>
+      <w:r>
+        <w:t xml:space="preserve"> </w:t>
+      </w:r>
+      <w:r>
+        <w:t xml:space="preserve">cavitación. No corresponde al cálculo del ventilador Sirocco.</w:t>
+      </w:r>
+    </w:p>
     <w:bookmarkEnd w:id="149"/>
-    <w:bookmarkStart w:id="150" w:name="limitación"/>
+    <w:bookmarkStart w:id="150" w:name="scopus_scraperpy"/>
+    <w:p>
+      <w:pPr>
+        <w:pStyle w:val="Heading3"/>
+      </w:pPr>
+      <w:r>
+        <w:rPr>
+          <w:rStyle w:val="VerbatimChar"/>
+        </w:rPr>
+        <w:t xml:space="preserve">scopus_scraper.py</w:t>
+      </w:r>
+    </w:p>
+    <w:p>
+      <w:pPr>
+        <w:pStyle w:val="FirstParagraph"/>
+      </w:pPr>
+      <w:r>
+        <w:t xml:space="preserve">Extractor de metadatos desde la API de Scopus. Usa</w:t>
+      </w:r>
+      <w:r>
+        <w:t xml:space="preserve"> </w:t>
+      </w:r>
+      <w:r>
+        <w:rPr>
+          <w:rStyle w:val="VerbatimChar"/>
+        </w:rPr>
+        <w:t xml:space="preserve">requests</w:t>
+      </w:r>
+      <w:r>
+        <w:t xml:space="preserve"> </w:t>
+      </w:r>
+      <w:r>
+        <w:t xml:space="preserve">y</w:t>
+      </w:r>
+      <w:r>
+        <w:t xml:space="preserve"> </w:t>
+      </w:r>
+      <w:r>
+        <w:rPr>
+          <w:rStyle w:val="VerbatimChar"/>
+        </w:rPr>
+        <w:t xml:space="preserve">pandas</w:t>
+      </w:r>
+      <w:r>
+        <w:t xml:space="preserve">, pagina</w:t>
+      </w:r>
+      <w:r>
+        <w:t xml:space="preserve"> </w:t>
+      </w:r>
+      <w:r>
+        <w:t xml:space="preserve">resultados, combina consultas y exporta un CSV. Requiere la variable de entorno</w:t>
+      </w:r>
+      <w:r>
+        <w:t xml:space="preserve"> </w:t>
+      </w:r>
+      <w:r>
+        <w:rPr>
+          <w:rStyle w:val="VerbatimChar"/>
+        </w:rPr>
+        <w:t xml:space="preserve">SCOPUS_API_KEY</w:t>
+      </w:r>
+      <w:r>
+        <w:t xml:space="preserve">; nunca debe guardarse una clave directamente en el repositorio.</w:t>
+      </w:r>
+    </w:p>
+    <w:bookmarkEnd w:id="150"/>
+    <w:bookmarkStart w:id="151" w:name="scopus_digital_twin_resultscsv"/>
+    <w:p>
+      <w:pPr>
+        <w:pStyle w:val="Heading3"/>
+      </w:pPr>
+      <w:r>
+        <w:rPr>
+          <w:rStyle w:val="VerbatimChar"/>
+        </w:rPr>
+        <w:t xml:space="preserve">scopus_digital_twin_results.csv</w:t>
+      </w:r>
+    </w:p>
+    <w:p>
+      <w:pPr>
+        <w:pStyle w:val="FirstParagraph"/>
+      </w:pPr>
+      <w:r>
+        <w:t xml:space="preserve">Contiene 49 registros y 11 columnas de metadatos sobre gemelos digitales,</w:t>
+      </w:r>
+      <w:r>
+        <w:t xml:space="preserve"> </w:t>
+      </w:r>
+      <w:r>
+        <w:t xml:space="preserve">bombas y temas relacionados. Debe revisarse manualmente porque una búsqueda</w:t>
+      </w:r>
+      <w:r>
+        <w:t xml:space="preserve"> </w:t>
+      </w:r>
+      <w:r>
+        <w:t xml:space="preserve">automática puede incluir resultados que no correspondan exactamente al tema.</w:t>
+      </w:r>
+    </w:p>
+    <w:bookmarkEnd w:id="151"/>
+    <w:bookmarkStart w:id="152" w:name="readme_scopusmd"/>
+    <w:p>
+      <w:pPr>
+        <w:pStyle w:val="Heading3"/>
+      </w:pPr>
+      <w:r>
+        <w:rPr>
+          <w:rStyle w:val="VerbatimChar"/>
+        </w:rPr>
+        <w:t xml:space="preserve">README_SCOPUS.md</w:t>
+      </w:r>
+    </w:p>
+    <w:p>
+      <w:pPr>
+        <w:pStyle w:val="FirstParagraph"/>
+      </w:pPr>
+      <w:r>
+        <w:t xml:space="preserve">Guía de instalación, configuración segura, estructura de consulta, ejecución y</w:t>
+      </w:r>
+      <w:r>
+        <w:t xml:space="preserve"> </w:t>
+      </w:r>
+      <w:r>
+        <w:t xml:space="preserve">campos del CSV.</w:t>
+      </w:r>
+    </w:p>
+    <w:bookmarkEnd w:id="152"/>
+    <w:bookmarkEnd w:id="153"/>
+    <w:bookmarkStart w:id="154" w:name="separación-temática"/>
     <w:p>
       <w:pPr>
         <w:pStyle w:val="Heading2"/>
       </w:pPr>
       <w:r>
+        <w:t xml:space="preserve">Separación temática</w:t>
+      </w:r>
+    </w:p>
+    <w:p>
+      <w:pPr>
+        <w:pStyle w:val="FirstParagraph"/>
+      </w:pPr>
+      <w:r>
+        <w:t xml:space="preserve">Esta línea de gemelos digitales para bombas se conserva como trabajo de</w:t>
+      </w:r>
+      <w:r>
+        <w:t xml:space="preserve"> </w:t>
+      </w:r>
+      <w:r>
+        <w:t xml:space="preserve">investigación independiente. No usar sus resultados como validación del</w:t>
+      </w:r>
+      <w:r>
+        <w:t xml:space="preserve"> </w:t>
+      </w:r>
+      <w:r>
+        <w:t xml:space="preserve">ventilador Sirocco ni mezclar sus referencias con la memoria del diseño sin una</w:t>
+      </w:r>
+      <w:r>
+        <w:t xml:space="preserve"> </w:t>
+      </w:r>
+      <w:r>
+        <w:t xml:space="preserve">justificación explícita.</w:t>
+      </w:r>
+    </w:p>
+    <w:bookmarkEnd w:id="154"/>
+    <w:bookmarkStart w:id="155" w:name="limitación"/>
+    <w:p>
+      <w:pPr>
+        <w:pStyle w:val="Heading2"/>
+      </w:pPr>
+      <w:r>
         <w:t xml:space="preserve">Limitación</w:t>
       </w:r>
     </w:p>
@@ -10405,13 +10627,19 @@
         <w:pStyle w:val="FirstParagraph"/>
       </w:pPr>
       <w:r>
-        <w:t xml:space="preserve">Este archivo es material de entrada. No contiene los cálculos reproducibles ni</w:t>
-      </w:r>
-      <w:r>
-        <w:t xml:space="preserve"> </w:t>
-      </w:r>
-      <w:r>
-        <w:t xml:space="preserve">los resultados vigentes del ventilador; estos se encuentran en</w:t>
+        <w:t xml:space="preserve">El DOCX es material de entrada y el artículo de gemelo digital corresponde a</w:t>
+      </w:r>
+      <w:r>
+        <w:t xml:space="preserve"> </w:t>
+      </w:r>
+      <w:r>
+        <w:t xml:space="preserve">otra turbomáquina. Ninguno contiene los cálculos reproducibles vigentes del</w:t>
+      </w:r>
+      <w:r>
+        <w:t xml:space="preserve"> </w:t>
+      </w:r>
+      <w:r>
+        <w:t xml:space="preserve">ventilador; estos se encuentran en</w:t>
       </w:r>
       <w:r>
         <w:t xml:space="preserve"> </w:t>
@@ -10439,420 +10667,11 @@
       </w:r>
       <w:r>
         <w:t xml:space="preserve">.</w:t>
-      </w:r>
-    </w:p>
-    <w:bookmarkEnd w:id="150"/>
-    <w:bookmarkEnd w:id="151"/>
-    <w:bookmarkStart w:id="156" w:name="X40fe5eed54285a62203823a8924f82acc712dad"/>
-    <w:p>
-      <w:pPr>
-        <w:pStyle w:val="Heading1"/>
-      </w:pPr>
-      <w:r>
-        <w:t xml:space="preserve">Documentación de</w:t>
-      </w:r>
-      <w:r>
-        <w:t xml:space="preserve"> </w:t>
-      </w:r>
-      <w:r>
-        <w:rPr>
-          <w:rStyle w:val="VerbatimChar"/>
-        </w:rPr>
-        <w:t xml:space="preserve">2 diseño de turbomaquina</w:t>
-      </w:r>
-    </w:p>
-    <w:bookmarkStart w:id="152" w:name="propósito-10"/>
-    <w:p>
-      <w:pPr>
-        <w:pStyle w:val="Heading2"/>
-      </w:pPr>
-      <w:r>
-        <w:t xml:space="preserve">Propósito</w:t>
-      </w:r>
-    </w:p>
-    <w:p>
-      <w:pPr>
-        <w:pStyle w:val="FirstParagraph"/>
-      </w:pPr>
-      <w:r>
-        <w:t xml:space="preserve">Conservar el enunciado original del trabajo de diseño asignado por el docente.</w:t>
-      </w:r>
-    </w:p>
-    <w:bookmarkEnd w:id="152"/>
-    <w:bookmarkStart w:id="153" w:name="requisito-del-grupo-2"/>
-    <w:p>
-      <w:pPr>
-        <w:pStyle w:val="Heading2"/>
-      </w:pPr>
-      <w:r>
-        <w:t xml:space="preserve">Requisito del Grupo 2</w:t>
-      </w:r>
-    </w:p>
-    <w:p>
-      <w:pPr>
-        <w:pStyle w:val="FirstParagraph"/>
-      </w:pPr>
-      <w:r>
-        <w:t xml:space="preserve">El archivo</w:t>
-      </w:r>
-      <w:r>
-        <w:t xml:space="preserve"> </w:t>
-      </w:r>
-      <w:r>
-        <w:rPr>
-          <w:rStyle w:val="VerbatimChar"/>
-        </w:rPr>
-        <w:t xml:space="preserve">Trabajo_Diseno_turbomaquinas_26-I.docx</w:t>
-      </w:r>
-      <w:r>
-        <w:t xml:space="preserve"> </w:t>
-      </w:r>
-      <w:r>
-        <w:t xml:space="preserve">asigna:</w:t>
-      </w:r>
-    </w:p>
-    <w:p>
-      <w:pPr>
-        <w:pStyle w:val="Compact"/>
-        <w:numPr>
-          <w:ilvl w:val="0"/>
-          <w:numId w:val="1031"/>
-        </w:numPr>
-      </w:pPr>
-      <w:r>
-        <w:t xml:space="preserve">Tipo: ventilador Sirocco.</w:t>
-      </w:r>
-    </w:p>
-    <w:p>
-      <w:pPr>
-        <w:pStyle w:val="Compact"/>
-        <w:numPr>
-          <w:ilvl w:val="0"/>
-          <w:numId w:val="1031"/>
-        </w:numPr>
-      </w:pPr>
-      <w:r>
-        <w:t xml:space="preserve">Altura de presión:</w:t>
-      </w:r>
-      <w:r>
-        <w:t xml:space="preserve"> </w:t>
-      </w:r>
-      <w:r>
-        <w:rPr>
-          <w:rStyle w:val="VerbatimChar"/>
-        </w:rPr>
-        <w:t xml:space="preserve">H = 90 mm de agua</w:t>
-      </w:r>
-      <w:r>
-        <w:t xml:space="preserve">.</w:t>
-      </w:r>
-    </w:p>
-    <w:p>
-      <w:pPr>
-        <w:pStyle w:val="Compact"/>
-        <w:numPr>
-          <w:ilvl w:val="0"/>
-          <w:numId w:val="1031"/>
-        </w:numPr>
-      </w:pPr>
-      <w:r>
-        <w:t xml:space="preserve">Caudal:</w:t>
-      </w:r>
-      <w:r>
-        <w:t xml:space="preserve"> </w:t>
-      </w:r>
-      <w:r>
-        <w:rPr>
-          <w:rStyle w:val="VerbatimChar"/>
-        </w:rPr>
-        <w:t xml:space="preserve">Q = 3 m³/s</w:t>
-      </w:r>
-      <w:r>
-        <w:t xml:space="preserve">.</w:t>
-      </w:r>
-    </w:p>
-    <w:p>
-      <w:pPr>
-        <w:pStyle w:val="Compact"/>
-        <w:numPr>
-          <w:ilvl w:val="0"/>
-          <w:numId w:val="1031"/>
-        </w:numPr>
-      </w:pPr>
-      <w:r>
-        <w:t xml:space="preserve">Grupo:</w:t>
-      </w:r>
-      <w:r>
-        <w:t xml:space="preserve"> </w:t>
-      </w:r>
-      <w:r>
-        <w:rPr>
-          <w:rStyle w:val="VerbatimChar"/>
-        </w:rPr>
-        <w:t xml:space="preserve">Grupo 02</w:t>
-      </w:r>
-      <w:r>
-        <w:t xml:space="preserve">.</w:t>
-      </w:r>
-    </w:p>
-    <w:p>
-      <w:pPr>
-        <w:pStyle w:val="Compact"/>
-        <w:numPr>
-          <w:ilvl w:val="0"/>
-          <w:numId w:val="1031"/>
-        </w:numPr>
-      </w:pPr>
-      <w:r>
-        <w:t xml:space="preserve">Docente: Ing. Armando Cruz Cabrera.</w:t>
-      </w:r>
-    </w:p>
-    <w:bookmarkEnd w:id="153"/>
-    <w:bookmarkStart w:id="154" w:name="entregables-solicitados"/>
-    <w:p>
-      <w:pPr>
-        <w:pStyle w:val="Heading2"/>
-      </w:pPr>
-      <w:r>
-        <w:t xml:space="preserve">Entregables solicitados</w:t>
-      </w:r>
-    </w:p>
-    <w:p>
-      <w:pPr>
-        <w:pStyle w:val="FirstParagraph"/>
-      </w:pPr>
-      <w:r>
-        <w:t xml:space="preserve">El enunciado pide:</w:t>
-      </w:r>
-    </w:p>
-    <w:p>
-      <w:pPr>
-        <w:pStyle w:val="Compact"/>
-        <w:numPr>
-          <w:ilvl w:val="0"/>
-          <w:numId w:val="1032"/>
-        </w:numPr>
-      </w:pPr>
-      <w:r>
-        <w:t xml:space="preserve">Cálculo del rodete.</w:t>
-      </w:r>
-    </w:p>
-    <w:p>
-      <w:pPr>
-        <w:pStyle w:val="Compact"/>
-        <w:numPr>
-          <w:ilvl w:val="0"/>
-          <w:numId w:val="1032"/>
-        </w:numPr>
-      </w:pPr>
-      <w:r>
-        <w:t xml:space="preserve">Cálculo de la voluta.</w:t>
-      </w:r>
-    </w:p>
-    <w:p>
-      <w:pPr>
-        <w:pStyle w:val="Compact"/>
-        <w:numPr>
-          <w:ilvl w:val="0"/>
-          <w:numId w:val="1032"/>
-        </w:numPr>
-      </w:pPr>
-      <w:r>
-        <w:t xml:space="preserve">Cálculo de pérdidas.</w:t>
-      </w:r>
-    </w:p>
-    <w:p>
-      <w:pPr>
-        <w:pStyle w:val="Compact"/>
-        <w:numPr>
-          <w:ilvl w:val="0"/>
-          <w:numId w:val="1032"/>
-        </w:numPr>
-      </w:pPr>
-      <w:r>
-        <w:t xml:space="preserve">Desarrollo de software.</w:t>
-      </w:r>
-    </w:p>
-    <w:p>
-      <w:pPr>
-        <w:pStyle w:val="Compact"/>
-        <w:numPr>
-          <w:ilvl w:val="0"/>
-          <w:numId w:val="1032"/>
-        </w:numPr>
-      </w:pPr>
-      <w:r>
-        <w:t xml:space="preserve">Construcción o propuesta mediante semejanza como modelo.</w:t>
-      </w:r>
-    </w:p>
-    <w:p>
-      <w:pPr>
-        <w:pStyle w:val="Compact"/>
-        <w:numPr>
-          <w:ilvl w:val="0"/>
-          <w:numId w:val="1032"/>
-        </w:numPr>
-      </w:pPr>
-      <w:r>
-        <w:t xml:space="preserve">Entrega digital e impresa según la programación del curso.</w:t>
-      </w:r>
-    </w:p>
-    <w:bookmarkEnd w:id="154"/>
-    <w:bookmarkStart w:id="155" w:name="trazabilidad"/>
-    <w:p>
-      <w:pPr>
-        <w:pStyle w:val="Heading2"/>
-      </w:pPr>
-      <w:r>
-        <w:t xml:space="preserve">Trazabilidad</w:t>
-      </w:r>
-    </w:p>
-    <w:p>
-      <w:pPr>
-        <w:pStyle w:val="Compact"/>
-        <w:numPr>
-          <w:ilvl w:val="0"/>
-          <w:numId w:val="1033"/>
-        </w:numPr>
-      </w:pPr>
-      <w:r>
-        <w:t xml:space="preserve">Rodete, voluta, pérdidas y semejanza:</w:t>
-      </w:r>
-      <w:r>
-        <w:t xml:space="preserve"> </w:t>
-      </w:r>
-      <w:r>
-        <w:rPr>
-          <w:rStyle w:val="VerbatimChar"/>
-        </w:rPr>
-        <w:t xml:space="preserve">06_calculos/</w:t>
-      </w:r>
-      <w:r>
-        <w:t xml:space="preserve">.</w:t>
-      </w:r>
-    </w:p>
-    <w:p>
-      <w:pPr>
-        <w:pStyle w:val="Compact"/>
-        <w:numPr>
-          <w:ilvl w:val="0"/>
-          <w:numId w:val="1033"/>
-        </w:numPr>
-      </w:pPr>
-      <w:r>
-        <w:t xml:space="preserve">Software:</w:t>
-      </w:r>
-      <w:r>
-        <w:t xml:space="preserve"> </w:t>
-      </w:r>
-      <w:r>
-        <w:rPr>
-          <w:rStyle w:val="VerbatimChar"/>
-        </w:rPr>
-        <w:t xml:space="preserve">08_software/</w:t>
-      </w:r>
-      <w:r>
-        <w:t xml:space="preserve">.</w:t>
-      </w:r>
-    </w:p>
-    <w:p>
-      <w:pPr>
-        <w:pStyle w:val="Compact"/>
-        <w:numPr>
-          <w:ilvl w:val="0"/>
-          <w:numId w:val="1033"/>
-        </w:numPr>
-      </w:pPr>
-      <w:r>
-        <w:t xml:space="preserve">Planos:</w:t>
-      </w:r>
-      <w:r>
-        <w:t xml:space="preserve"> </w:t>
-      </w:r>
-      <w:r>
-        <w:rPr>
-          <w:rStyle w:val="VerbatimChar"/>
-        </w:rPr>
-        <w:t xml:space="preserve">07_planos/</w:t>
-      </w:r>
-      <w:r>
-        <w:t xml:space="preserve">.</w:t>
-      </w:r>
-    </w:p>
-    <w:p>
-      <w:pPr>
-        <w:pStyle w:val="Compact"/>
-        <w:numPr>
-          <w:ilvl w:val="0"/>
-          <w:numId w:val="1033"/>
-        </w:numPr>
-      </w:pPr>
-      <w:r>
-        <w:t xml:space="preserve">Modelo 3D:</w:t>
-      </w:r>
-      <w:r>
-        <w:t xml:space="preserve"> </w:t>
-      </w:r>
-      <w:r>
-        <w:rPr>
-          <w:rStyle w:val="VerbatimChar"/>
-        </w:rPr>
-        <w:t xml:space="preserve">07_modelos_3d/</w:t>
-      </w:r>
-      <w:r>
-        <w:t xml:space="preserve"> </w:t>
-      </w:r>
-      <w:r>
-        <w:t xml:space="preserve">y</w:t>
-      </w:r>
-      <w:r>
-        <w:t xml:space="preserve"> </w:t>
-      </w:r>
-      <w:r>
-        <w:rPr>
-          <w:rStyle w:val="VerbatimChar"/>
-        </w:rPr>
-        <w:t xml:space="preserve">10_interfaz_3d/</w:t>
-      </w:r>
-      <w:r>
-        <w:t xml:space="preserve">.</w:t>
-      </w:r>
-    </w:p>
-    <w:p>
-      <w:pPr>
-        <w:pStyle w:val="Compact"/>
-        <w:numPr>
-          <w:ilvl w:val="0"/>
-          <w:numId w:val="1033"/>
-        </w:numPr>
-      </w:pPr>
-      <w:r>
-        <w:t xml:space="preserve">Informe para presentar:</w:t>
-      </w:r>
-      <w:r>
-        <w:t xml:space="preserve"> </w:t>
-      </w:r>
-      <w:r>
-        <w:rPr>
-          <w:rStyle w:val="VerbatimChar"/>
-        </w:rPr>
-        <w:t xml:space="preserve">09_reporte/</w:t>
-      </w:r>
-      <w:r>
-        <w:t xml:space="preserve">.</w:t>
-      </w:r>
-    </w:p>
-    <w:p>
-      <w:pPr>
-        <w:pStyle w:val="FirstParagraph"/>
-      </w:pPr>
-      <w:r>
-        <w:t xml:space="preserve">Este documento define el problema; no es una memoria de cálculo.</w:t>
       </w:r>
     </w:p>
     <w:bookmarkEnd w:id="155"/>
     <w:bookmarkEnd w:id="156"/>
-    <w:bookmarkStart w:id="161" w:name="X6154e7ef435597659bcbf99be42d0a9cf455120"/>
+    <w:bookmarkStart w:id="161" w:name="X40fe5eed54285a62203823a8924f82acc712dad"/>
     <w:p>
       <w:pPr>
         <w:pStyle w:val="Heading1"/>
@@ -10867,10 +10686,10 @@
         <w:rPr>
           <w:rStyle w:val="VerbatimChar"/>
         </w:rPr>
-        <w:t xml:space="preserve">3 resolución de problemas</w:t>
-      </w:r>
-    </w:p>
-    <w:bookmarkStart w:id="157" w:name="propósito-11"/>
+        <w:t xml:space="preserve">2 diseño de turbomaquina</w:t>
+      </w:r>
+    </w:p>
+    <w:bookmarkStart w:id="157" w:name="propósito-10"/>
     <w:p>
       <w:pPr>
         <w:pStyle w:val="Heading2"/>
@@ -10884,29 +10703,29 @@
         <w:pStyle w:val="FirstParagraph"/>
       </w:pPr>
       <w:r>
-        <w:t xml:space="preserve">Conservar el archivo del curso asociado a la resolución de problemas y a las</w:t>
-      </w:r>
-      <w:r>
-        <w:t xml:space="preserve"> </w:t>
-      </w:r>
-      <w:r>
-        <w:t xml:space="preserve">aclaraciones de entrega.</w:t>
+        <w:t xml:space="preserve">Conservar el enunciado original del trabajo de diseño asignado por el docente.</w:t>
       </w:r>
     </w:p>
     <w:bookmarkEnd w:id="157"/>
-    <w:bookmarkStart w:id="158" w:name="archivo-1"/>
+    <w:bookmarkStart w:id="158" w:name="requisito-del-grupo-2"/>
     <w:p>
       <w:pPr>
         <w:pStyle w:val="Heading2"/>
       </w:pPr>
       <w:r>
-        <w:t xml:space="preserve">Archivo</w:t>
-      </w:r>
-    </w:p>
-    <w:p>
-      <w:pPr>
-        <w:pStyle w:val="FirstParagraph"/>
-      </w:pPr>
+        <w:t xml:space="preserve">Requisito del Grupo 2</w:t>
+      </w:r>
+    </w:p>
+    <w:p>
+      <w:pPr>
+        <w:pStyle w:val="FirstParagraph"/>
+      </w:pPr>
+      <w:r>
+        <w:t xml:space="preserve">El archivo</w:t>
+      </w:r>
+      <w:r>
+        <w:t xml:space="preserve"> </w:t>
+      </w:r>
       <w:r>
         <w:rPr>
           <w:rStyle w:val="VerbatimChar"/>
@@ -10917,68 +10736,224 @@
         <w:t xml:space="preserve"> </w:t>
       </w:r>
       <w:r>
-        <w:t xml:space="preserve">es actualmente idéntico al documento</w:t>
-      </w:r>
-      <w:r>
-        <w:t xml:space="preserve"> </w:t>
-      </w:r>
-      <w:r>
-        <w:t xml:space="preserve">guardado en</w:t>
-      </w:r>
-      <w:r>
-        <w:t xml:space="preserve"> </w:t>
-      </w:r>
-      <w:r>
-        <w:rPr>
-          <w:rStyle w:val="VerbatimChar"/>
-        </w:rPr>
-        <w:t xml:space="preserve">2 diseño de turbomaquina/</w:t>
-      </w:r>
-      <w:r>
-        <w:t xml:space="preserve">. Incluye la lista de temas para los</w:t>
-      </w:r>
-      <w:r>
-        <w:t xml:space="preserve"> </w:t>
-      </w:r>
-      <w:r>
-        <w:t xml:space="preserve">grupos y las aclaraciones del docente.</w:t>
+        <w:t xml:space="preserve">asigna:</w:t>
+      </w:r>
+    </w:p>
+    <w:p>
+      <w:pPr>
+        <w:pStyle w:val="Compact"/>
+        <w:numPr>
+          <w:ilvl w:val="0"/>
+          <w:numId w:val="1031"/>
+        </w:numPr>
+      </w:pPr>
+      <w:r>
+        <w:t xml:space="preserve">Tipo: ventilador Sirocco.</w:t>
+      </w:r>
+    </w:p>
+    <w:p>
+      <w:pPr>
+        <w:pStyle w:val="Compact"/>
+        <w:numPr>
+          <w:ilvl w:val="0"/>
+          <w:numId w:val="1031"/>
+        </w:numPr>
+      </w:pPr>
+      <w:r>
+        <w:t xml:space="preserve">Altura de presión:</w:t>
+      </w:r>
+      <w:r>
+        <w:t xml:space="preserve"> </w:t>
+      </w:r>
+      <w:r>
+        <w:rPr>
+          <w:rStyle w:val="VerbatimChar"/>
+        </w:rPr>
+        <w:t xml:space="preserve">H = 90 mm de agua</w:t>
+      </w:r>
+      <w:r>
+        <w:t xml:space="preserve">.</w:t>
+      </w:r>
+    </w:p>
+    <w:p>
+      <w:pPr>
+        <w:pStyle w:val="Compact"/>
+        <w:numPr>
+          <w:ilvl w:val="0"/>
+          <w:numId w:val="1031"/>
+        </w:numPr>
+      </w:pPr>
+      <w:r>
+        <w:t xml:space="preserve">Caudal:</w:t>
+      </w:r>
+      <w:r>
+        <w:t xml:space="preserve"> </w:t>
+      </w:r>
+      <w:r>
+        <w:rPr>
+          <w:rStyle w:val="VerbatimChar"/>
+        </w:rPr>
+        <w:t xml:space="preserve">Q = 3 m³/s</w:t>
+      </w:r>
+      <w:r>
+        <w:t xml:space="preserve">.</w:t>
+      </w:r>
+    </w:p>
+    <w:p>
+      <w:pPr>
+        <w:pStyle w:val="Compact"/>
+        <w:numPr>
+          <w:ilvl w:val="0"/>
+          <w:numId w:val="1031"/>
+        </w:numPr>
+      </w:pPr>
+      <w:r>
+        <w:t xml:space="preserve">Grupo:</w:t>
+      </w:r>
+      <w:r>
+        <w:t xml:space="preserve"> </w:t>
+      </w:r>
+      <w:r>
+        <w:rPr>
+          <w:rStyle w:val="VerbatimChar"/>
+        </w:rPr>
+        <w:t xml:space="preserve">Grupo 02</w:t>
+      </w:r>
+      <w:r>
+        <w:t xml:space="preserve">.</w:t>
+      </w:r>
+    </w:p>
+    <w:p>
+      <w:pPr>
+        <w:pStyle w:val="Compact"/>
+        <w:numPr>
+          <w:ilvl w:val="0"/>
+          <w:numId w:val="1031"/>
+        </w:numPr>
+      </w:pPr>
+      <w:r>
+        <w:t xml:space="preserve">Docente: Ing. Armando Cruz Cabrera.</w:t>
       </w:r>
     </w:p>
     <w:bookmarkEnd w:id="158"/>
-    <w:bookmarkStart w:id="159" w:name="contenido-relevante-para-este-proyecto"/>
+    <w:bookmarkStart w:id="159" w:name="entregables-solicitados"/>
     <w:p>
       <w:pPr>
         <w:pStyle w:val="Heading2"/>
       </w:pPr>
       <w:r>
-        <w:t xml:space="preserve">Contenido relevante para este proyecto</w:t>
-      </w:r>
-    </w:p>
-    <w:p>
-      <w:pPr>
-        <w:pStyle w:val="Compact"/>
-        <w:numPr>
-          <w:ilvl w:val="0"/>
-          <w:numId w:val="1034"/>
-        </w:numPr>
-      </w:pPr>
-      <w:r>
-        <w:t xml:space="preserve">Ventilador tipo Sirocco.</w:t>
-      </w:r>
-    </w:p>
-    <w:p>
-      <w:pPr>
-        <w:pStyle w:val="Compact"/>
-        <w:numPr>
-          <w:ilvl w:val="0"/>
-          <w:numId w:val="1034"/>
-        </w:numPr>
-      </w:pPr>
-      <w:r>
-        <w:rPr>
-          <w:rStyle w:val="VerbatimChar"/>
-        </w:rPr>
-        <w:t xml:space="preserve">H = 90 mmH₂O</w:t>
+        <w:t xml:space="preserve">Entregables solicitados</w:t>
+      </w:r>
+    </w:p>
+    <w:p>
+      <w:pPr>
+        <w:pStyle w:val="FirstParagraph"/>
+      </w:pPr>
+      <w:r>
+        <w:t xml:space="preserve">El enunciado pide:</w:t>
+      </w:r>
+    </w:p>
+    <w:p>
+      <w:pPr>
+        <w:pStyle w:val="Compact"/>
+        <w:numPr>
+          <w:ilvl w:val="0"/>
+          <w:numId w:val="1032"/>
+        </w:numPr>
+      </w:pPr>
+      <w:r>
+        <w:t xml:space="preserve">Cálculo del rodete.</w:t>
+      </w:r>
+    </w:p>
+    <w:p>
+      <w:pPr>
+        <w:pStyle w:val="Compact"/>
+        <w:numPr>
+          <w:ilvl w:val="0"/>
+          <w:numId w:val="1032"/>
+        </w:numPr>
+      </w:pPr>
+      <w:r>
+        <w:t xml:space="preserve">Cálculo de la voluta.</w:t>
+      </w:r>
+    </w:p>
+    <w:p>
+      <w:pPr>
+        <w:pStyle w:val="Compact"/>
+        <w:numPr>
+          <w:ilvl w:val="0"/>
+          <w:numId w:val="1032"/>
+        </w:numPr>
+      </w:pPr>
+      <w:r>
+        <w:t xml:space="preserve">Cálculo de pérdidas.</w:t>
+      </w:r>
+    </w:p>
+    <w:p>
+      <w:pPr>
+        <w:pStyle w:val="Compact"/>
+        <w:numPr>
+          <w:ilvl w:val="0"/>
+          <w:numId w:val="1032"/>
+        </w:numPr>
+      </w:pPr>
+      <w:r>
+        <w:t xml:space="preserve">Desarrollo de software.</w:t>
+      </w:r>
+    </w:p>
+    <w:p>
+      <w:pPr>
+        <w:pStyle w:val="Compact"/>
+        <w:numPr>
+          <w:ilvl w:val="0"/>
+          <w:numId w:val="1032"/>
+        </w:numPr>
+      </w:pPr>
+      <w:r>
+        <w:t xml:space="preserve">Construcción o propuesta mediante semejanza como modelo.</w:t>
+      </w:r>
+    </w:p>
+    <w:p>
+      <w:pPr>
+        <w:pStyle w:val="Compact"/>
+        <w:numPr>
+          <w:ilvl w:val="0"/>
+          <w:numId w:val="1032"/>
+        </w:numPr>
+      </w:pPr>
+      <w:r>
+        <w:t xml:space="preserve">Entrega digital e impresa según la programación del curso.</w:t>
+      </w:r>
+    </w:p>
+    <w:bookmarkEnd w:id="159"/>
+    <w:bookmarkStart w:id="160" w:name="trazabilidad"/>
+    <w:p>
+      <w:pPr>
+        <w:pStyle w:val="Heading2"/>
+      </w:pPr>
+      <w:r>
+        <w:t xml:space="preserve">Trazabilidad</w:t>
+      </w:r>
+    </w:p>
+    <w:p>
+      <w:pPr>
+        <w:pStyle w:val="Compact"/>
+        <w:numPr>
+          <w:ilvl w:val="0"/>
+          <w:numId w:val="1033"/>
+        </w:numPr>
+      </w:pPr>
+      <w:r>
+        <w:t xml:space="preserve">Rodete, voluta, pérdidas y semejanza:</w:t>
+      </w:r>
+      <w:r>
+        <w:t xml:space="preserve"> </w:t>
+      </w:r>
+      <w:r>
+        <w:rPr>
+          <w:rStyle w:val="VerbatimChar"/>
+        </w:rPr>
+        <w:t xml:space="preserve">06_calculos/</w:t>
       </w:r>
       <w:r>
         <w:t xml:space="preserve">.</w:t>
@@ -10989,14 +10964,20 @@
         <w:pStyle w:val="Compact"/>
         <w:numPr>
           <w:ilvl w:val="0"/>
-          <w:numId w:val="1034"/>
-        </w:numPr>
-      </w:pPr>
-      <w:r>
-        <w:rPr>
-          <w:rStyle w:val="VerbatimChar"/>
-        </w:rPr>
-        <w:t xml:space="preserve">Q = 3 m³/s</w:t>
+          <w:numId w:val="1033"/>
+        </w:numPr>
+      </w:pPr>
+      <w:r>
+        <w:t xml:space="preserve">Software:</w:t>
+      </w:r>
+      <w:r>
+        <w:t xml:space="preserve"> </w:t>
+      </w:r>
+      <w:r>
+        <w:rPr>
+          <w:rStyle w:val="VerbatimChar"/>
+        </w:rPr>
+        <w:t xml:space="preserve">08_software/</w:t>
       </w:r>
       <w:r>
         <w:t xml:space="preserve">.</w:t>
@@ -11007,70 +10988,99 @@
         <w:pStyle w:val="Compact"/>
         <w:numPr>
           <w:ilvl w:val="0"/>
-          <w:numId w:val="1034"/>
-        </w:numPr>
-      </w:pPr>
-      <w:r>
-        <w:t xml:space="preserve">Cálculo de rodete, voluta y pérdidas.</w:t>
-      </w:r>
-    </w:p>
-    <w:p>
-      <w:pPr>
-        <w:pStyle w:val="Compact"/>
-        <w:numPr>
-          <w:ilvl w:val="0"/>
-          <w:numId w:val="1034"/>
-        </w:numPr>
-      </w:pPr>
-      <w:r>
-        <w:t xml:space="preserve">Proyección de software.</w:t>
-      </w:r>
-    </w:p>
-    <w:p>
-      <w:pPr>
-        <w:pStyle w:val="Compact"/>
-        <w:numPr>
-          <w:ilvl w:val="0"/>
-          <w:numId w:val="1034"/>
-        </w:numPr>
-      </w:pPr>
-      <w:r>
-        <w:t xml:space="preserve">Uso de semejanza para un modelo.</w:t>
-      </w:r>
-    </w:p>
-    <w:bookmarkEnd w:id="159"/>
-    <w:bookmarkStart w:id="160" w:name="recomendación"/>
-    <w:p>
-      <w:pPr>
-        <w:pStyle w:val="Heading2"/>
-      </w:pPr>
-      <w:r>
-        <w:t xml:space="preserve">Recomendación</w:t>
-      </w:r>
-    </w:p>
-    <w:p>
-      <w:pPr>
-        <w:pStyle w:val="FirstParagraph"/>
-      </w:pPr>
-      <w:r>
-        <w:t xml:space="preserve">Mantener esta copia como evidencia del enunciado. Si posteriormente se reciben</w:t>
-      </w:r>
-      <w:r>
-        <w:t xml:space="preserve"> </w:t>
-      </w:r>
-      <w:r>
-        <w:t xml:space="preserve">problemas numéricos independientes, agregarlos aquí con nombre, fecha,</w:t>
-      </w:r>
-      <w:r>
-        <w:t xml:space="preserve"> </w:t>
-      </w:r>
-      <w:r>
-        <w:t xml:space="preserve">desarrollo, unidades y respuesta verificada.</w:t>
+          <w:numId w:val="1033"/>
+        </w:numPr>
+      </w:pPr>
+      <w:r>
+        <w:t xml:space="preserve">Planos:</w:t>
+      </w:r>
+      <w:r>
+        <w:t xml:space="preserve"> </w:t>
+      </w:r>
+      <w:r>
+        <w:rPr>
+          <w:rStyle w:val="VerbatimChar"/>
+        </w:rPr>
+        <w:t xml:space="preserve">07_planos/</w:t>
+      </w:r>
+      <w:r>
+        <w:t xml:space="preserve">.</w:t>
+      </w:r>
+    </w:p>
+    <w:p>
+      <w:pPr>
+        <w:pStyle w:val="Compact"/>
+        <w:numPr>
+          <w:ilvl w:val="0"/>
+          <w:numId w:val="1033"/>
+        </w:numPr>
+      </w:pPr>
+      <w:r>
+        <w:t xml:space="preserve">Modelo 3D:</w:t>
+      </w:r>
+      <w:r>
+        <w:t xml:space="preserve"> </w:t>
+      </w:r>
+      <w:r>
+        <w:rPr>
+          <w:rStyle w:val="VerbatimChar"/>
+        </w:rPr>
+        <w:t xml:space="preserve">07_modelos_3d/</w:t>
+      </w:r>
+      <w:r>
+        <w:t xml:space="preserve"> </w:t>
+      </w:r>
+      <w:r>
+        <w:t xml:space="preserve">y</w:t>
+      </w:r>
+      <w:r>
+        <w:t xml:space="preserve"> </w:t>
+      </w:r>
+      <w:r>
+        <w:rPr>
+          <w:rStyle w:val="VerbatimChar"/>
+        </w:rPr>
+        <w:t xml:space="preserve">10_interfaz_3d/</w:t>
+      </w:r>
+      <w:r>
+        <w:t xml:space="preserve">.</w:t>
+      </w:r>
+    </w:p>
+    <w:p>
+      <w:pPr>
+        <w:pStyle w:val="Compact"/>
+        <w:numPr>
+          <w:ilvl w:val="0"/>
+          <w:numId w:val="1033"/>
+        </w:numPr>
+      </w:pPr>
+      <w:r>
+        <w:t xml:space="preserve">Informe para presentar:</w:t>
+      </w:r>
+      <w:r>
+        <w:t xml:space="preserve"> </w:t>
+      </w:r>
+      <w:r>
+        <w:rPr>
+          <w:rStyle w:val="VerbatimChar"/>
+        </w:rPr>
+        <w:t xml:space="preserve">09_reporte/</w:t>
+      </w:r>
+      <w:r>
+        <w:t xml:space="preserve">.</w:t>
+      </w:r>
+    </w:p>
+    <w:p>
+      <w:pPr>
+        <w:pStyle w:val="FirstParagraph"/>
+      </w:pPr>
+      <w:r>
+        <w:t xml:space="preserve">Este documento define el problema; no es una memoria de cálculo.</w:t>
       </w:r>
     </w:p>
     <w:bookmarkEnd w:id="160"/>
     <w:bookmarkEnd w:id="161"/>
-    <w:bookmarkStart w:id="170" w:name="documentación-de-documento_latex"/>
+    <w:bookmarkStart w:id="166" w:name="X6154e7ef435597659bcbf99be42d0a9cf455120"/>
     <w:p>
       <w:pPr>
         <w:pStyle w:val="Heading1"/>
@@ -11085,10 +11095,10 @@
         <w:rPr>
           <w:rStyle w:val="VerbatimChar"/>
         </w:rPr>
-        <w:t xml:space="preserve">documento_latex</w:t>
-      </w:r>
-    </w:p>
-    <w:bookmarkStart w:id="162" w:name="propósito-12"/>
+        <w:t xml:space="preserve">3 resolución de problemas</w:t>
+      </w:r>
+    </w:p>
+    <w:bookmarkStart w:id="162" w:name="propósito-11"/>
     <w:p>
       <w:pPr>
         <w:pStyle w:val="Heading2"/>
@@ -11102,101 +11112,319 @@
         <w:pStyle w:val="FirstParagraph"/>
       </w:pPr>
       <w:r>
-        <w:t xml:space="preserve">Conservar una versión alternativa del informe escrita en LaTeX.</w:t>
+        <w:t xml:space="preserve">Conservar el archivo del curso asociado a la resolución de problemas y a las</w:t>
+      </w:r>
+      <w:r>
+        <w:t xml:space="preserve"> </w:t>
+      </w:r>
+      <w:r>
+        <w:t xml:space="preserve">aclaraciones de entrega.</w:t>
       </w:r>
     </w:p>
     <w:bookmarkEnd w:id="162"/>
-    <w:bookmarkStart w:id="166" w:name="archivos-5"/>
+    <w:bookmarkStart w:id="163" w:name="archivo"/>
     <w:p>
       <w:pPr>
         <w:pStyle w:val="Heading2"/>
       </w:pPr>
       <w:r>
-        <w:t xml:space="preserve">Archivos</w:t>
-      </w:r>
-    </w:p>
-    <w:bookmarkStart w:id="163" w:name="reporte_diseno_siroccotex"/>
-    <w:p>
-      <w:pPr>
-        <w:pStyle w:val="Heading3"/>
-      </w:pPr>
-      <w:r>
-        <w:rPr>
-          <w:rStyle w:val="VerbatimChar"/>
-        </w:rPr>
-        <w:t xml:space="preserve">reporte_diseno_sirocco.tex</w:t>
-      </w:r>
-    </w:p>
-    <w:p>
-      <w:pPr>
-        <w:pStyle w:val="FirstParagraph"/>
-      </w:pPr>
-      <w:r>
-        <w:t xml:space="preserve">Fuente LaTeX con portada, índice, configuración seleccionada, geometría,</w:t>
-      </w:r>
-      <w:r>
-        <w:t xml:space="preserve"> </w:t>
-      </w:r>
-      <w:r>
-        <w:t xml:space="preserve">triángulo de velocidades, potencia, voluta, comparación de rpm y estructura del</w:t>
-      </w:r>
-      <w:r>
-        <w:t xml:space="preserve"> </w:t>
-      </w:r>
-      <w:r>
-        <w:t xml:space="preserve">repositorio.</w:t>
+        <w:t xml:space="preserve">Archivo</w:t>
+      </w:r>
+    </w:p>
+    <w:p>
+      <w:pPr>
+        <w:pStyle w:val="FirstParagraph"/>
+      </w:pPr>
+      <w:r>
+        <w:rPr>
+          <w:rStyle w:val="VerbatimChar"/>
+        </w:rPr>
+        <w:t xml:space="preserve">Trabajo_Diseno_turbomaquinas_26-I.docx</w:t>
+      </w:r>
+      <w:r>
+        <w:t xml:space="preserve"> </w:t>
+      </w:r>
+      <w:r>
+        <w:t xml:space="preserve">es actualmente idéntico al documento</w:t>
+      </w:r>
+      <w:r>
+        <w:t xml:space="preserve"> </w:t>
+      </w:r>
+      <w:r>
+        <w:t xml:space="preserve">guardado en</w:t>
+      </w:r>
+      <w:r>
+        <w:t xml:space="preserve"> </w:t>
+      </w:r>
+      <w:r>
+        <w:rPr>
+          <w:rStyle w:val="VerbatimChar"/>
+        </w:rPr>
+        <w:t xml:space="preserve">2 diseño de turbomaquina/</w:t>
+      </w:r>
+      <w:r>
+        <w:t xml:space="preserve">. Incluye la lista de temas para los</w:t>
+      </w:r>
+      <w:r>
+        <w:t xml:space="preserve"> </w:t>
+      </w:r>
+      <w:r>
+        <w:t xml:space="preserve">grupos y las aclaraciones del docente.</w:t>
       </w:r>
     </w:p>
     <w:bookmarkEnd w:id="163"/>
-    <w:bookmarkStart w:id="164" w:name="reporte_diseno_siroccopdf"/>
-    <w:p>
-      <w:pPr>
-        <w:pStyle w:val="Heading3"/>
-      </w:pPr>
-      <w:r>
-        <w:rPr>
-          <w:rStyle w:val="VerbatimChar"/>
-        </w:rPr>
-        <w:t xml:space="preserve">reporte_diseno_sirocco.pdf</w:t>
-      </w:r>
-    </w:p>
-    <w:p>
-      <w:pPr>
-        <w:pStyle w:val="FirstParagraph"/>
-      </w:pPr>
-      <w:r>
-        <w:t xml:space="preserve">Compilación A4 de 5 páginas. Es una memoria breve de revisión V1.</w:t>
+    <w:bookmarkStart w:id="164" w:name="contenido-relevante-para-este-proyecto"/>
+    <w:p>
+      <w:pPr>
+        <w:pStyle w:val="Heading2"/>
+      </w:pPr>
+      <w:r>
+        <w:t xml:space="preserve">Contenido relevante para este proyecto</w:t>
+      </w:r>
+    </w:p>
+    <w:p>
+      <w:pPr>
+        <w:pStyle w:val="Compact"/>
+        <w:numPr>
+          <w:ilvl w:val="0"/>
+          <w:numId w:val="1034"/>
+        </w:numPr>
+      </w:pPr>
+      <w:r>
+        <w:t xml:space="preserve">Ventilador tipo Sirocco.</w:t>
+      </w:r>
+    </w:p>
+    <w:p>
+      <w:pPr>
+        <w:pStyle w:val="Compact"/>
+        <w:numPr>
+          <w:ilvl w:val="0"/>
+          <w:numId w:val="1034"/>
+        </w:numPr>
+      </w:pPr>
+      <w:r>
+        <w:rPr>
+          <w:rStyle w:val="VerbatimChar"/>
+        </w:rPr>
+        <w:t xml:space="preserve">H = 90 mmH₂O</w:t>
+      </w:r>
+      <w:r>
+        <w:t xml:space="preserve">.</w:t>
+      </w:r>
+    </w:p>
+    <w:p>
+      <w:pPr>
+        <w:pStyle w:val="Compact"/>
+        <w:numPr>
+          <w:ilvl w:val="0"/>
+          <w:numId w:val="1034"/>
+        </w:numPr>
+      </w:pPr>
+      <w:r>
+        <w:rPr>
+          <w:rStyle w:val="VerbatimChar"/>
+        </w:rPr>
+        <w:t xml:space="preserve">Q = 3 m³/s</w:t>
+      </w:r>
+      <w:r>
+        <w:t xml:space="preserve">.</w:t>
+      </w:r>
+    </w:p>
+    <w:p>
+      <w:pPr>
+        <w:pStyle w:val="Compact"/>
+        <w:numPr>
+          <w:ilvl w:val="0"/>
+          <w:numId w:val="1034"/>
+        </w:numPr>
+      </w:pPr>
+      <w:r>
+        <w:t xml:space="preserve">Cálculo de rodete, voluta y pérdidas.</w:t>
+      </w:r>
+    </w:p>
+    <w:p>
+      <w:pPr>
+        <w:pStyle w:val="Compact"/>
+        <w:numPr>
+          <w:ilvl w:val="0"/>
+          <w:numId w:val="1034"/>
+        </w:numPr>
+      </w:pPr>
+      <w:r>
+        <w:t xml:space="preserve">Proyección de software.</w:t>
+      </w:r>
+    </w:p>
+    <w:p>
+      <w:pPr>
+        <w:pStyle w:val="Compact"/>
+        <w:numPr>
+          <w:ilvl w:val="0"/>
+          <w:numId w:val="1034"/>
+        </w:numPr>
+      </w:pPr>
+      <w:r>
+        <w:t xml:space="preserve">Uso de semejanza para un modelo.</w:t>
       </w:r>
     </w:p>
     <w:bookmarkEnd w:id="164"/>
-    <w:bookmarkStart w:id="165" w:name="assetssirocco_fan_renderjpg"/>
-    <w:p>
-      <w:pPr>
-        <w:pStyle w:val="Heading3"/>
-      </w:pPr>
-      <w:r>
-        <w:rPr>
-          <w:rStyle w:val="VerbatimChar"/>
-        </w:rPr>
-        <w:t xml:space="preserve">assets/sirocco_fan_render.jpg</w:t>
-      </w:r>
-    </w:p>
-    <w:p>
-      <w:pPr>
-        <w:pStyle w:val="FirstParagraph"/>
-      </w:pPr>
-      <w:r>
-        <w:t xml:space="preserve">Imagen utilizada en materiales visuales.</w:t>
+    <w:bookmarkStart w:id="165" w:name="recomendación"/>
+    <w:p>
+      <w:pPr>
+        <w:pStyle w:val="Heading2"/>
+      </w:pPr>
+      <w:r>
+        <w:t xml:space="preserve">Recomendación</w:t>
+      </w:r>
+    </w:p>
+    <w:p>
+      <w:pPr>
+        <w:pStyle w:val="FirstParagraph"/>
+      </w:pPr>
+      <w:r>
+        <w:t xml:space="preserve">Mantener esta copia como evidencia del enunciado. Si posteriormente se reciben</w:t>
+      </w:r>
+      <w:r>
+        <w:t xml:space="preserve"> </w:t>
+      </w:r>
+      <w:r>
+        <w:t xml:space="preserve">problemas numéricos independientes, agregarlos aquí con nombre, fecha,</w:t>
+      </w:r>
+      <w:r>
+        <w:t xml:space="preserve"> </w:t>
+      </w:r>
+      <w:r>
+        <w:t xml:space="preserve">desarrollo, unidades y respuesta verificada.</w:t>
       </w:r>
     </w:p>
     <w:bookmarkEnd w:id="165"/>
     <w:bookmarkEnd w:id="166"/>
-    <w:bookmarkStart w:id="167" w:name="ecuaciones-incluidas"/>
+    <w:bookmarkStart w:id="175" w:name="documentación-de-documento_latex"/>
+    <w:p>
+      <w:pPr>
+        <w:pStyle w:val="Heading1"/>
+      </w:pPr>
+      <w:r>
+        <w:t xml:space="preserve">Documentación de</w:t>
+      </w:r>
+      <w:r>
+        <w:t xml:space="preserve"> </w:t>
+      </w:r>
+      <w:r>
+        <w:rPr>
+          <w:rStyle w:val="VerbatimChar"/>
+        </w:rPr>
+        <w:t xml:space="preserve">documento_latex</w:t>
+      </w:r>
+    </w:p>
+    <w:bookmarkStart w:id="167" w:name="propósito-12"/>
     <w:p>
       <w:pPr>
         <w:pStyle w:val="Heading2"/>
       </w:pPr>
       <w:r>
+        <w:t xml:space="preserve">Propósito</w:t>
+      </w:r>
+    </w:p>
+    <w:p>
+      <w:pPr>
+        <w:pStyle w:val="FirstParagraph"/>
+      </w:pPr>
+      <w:r>
+        <w:t xml:space="preserve">Conservar una versión alternativa del informe escrita en LaTeX.</w:t>
+      </w:r>
+    </w:p>
+    <w:bookmarkEnd w:id="167"/>
+    <w:bookmarkStart w:id="171" w:name="archivos-6"/>
+    <w:p>
+      <w:pPr>
+        <w:pStyle w:val="Heading2"/>
+      </w:pPr>
+      <w:r>
+        <w:t xml:space="preserve">Archivos</w:t>
+      </w:r>
+    </w:p>
+    <w:bookmarkStart w:id="168" w:name="reporte_diseno_siroccotex"/>
+    <w:p>
+      <w:pPr>
+        <w:pStyle w:val="Heading3"/>
+      </w:pPr>
+      <w:r>
+        <w:rPr>
+          <w:rStyle w:val="VerbatimChar"/>
+        </w:rPr>
+        <w:t xml:space="preserve">reporte_diseno_sirocco.tex</w:t>
+      </w:r>
+    </w:p>
+    <w:p>
+      <w:pPr>
+        <w:pStyle w:val="FirstParagraph"/>
+      </w:pPr>
+      <w:r>
+        <w:t xml:space="preserve">Fuente LaTeX con portada, índice, configuración seleccionada, geometría,</w:t>
+      </w:r>
+      <w:r>
+        <w:t xml:space="preserve"> </w:t>
+      </w:r>
+      <w:r>
+        <w:t xml:space="preserve">triángulo de velocidades, potencia, voluta, comparación de rpm y estructura del</w:t>
+      </w:r>
+      <w:r>
+        <w:t xml:space="preserve"> </w:t>
+      </w:r>
+      <w:r>
+        <w:t xml:space="preserve">repositorio.</w:t>
+      </w:r>
+    </w:p>
+    <w:bookmarkEnd w:id="168"/>
+    <w:bookmarkStart w:id="169" w:name="reporte_diseno_siroccopdf"/>
+    <w:p>
+      <w:pPr>
+        <w:pStyle w:val="Heading3"/>
+      </w:pPr>
+      <w:r>
+        <w:rPr>
+          <w:rStyle w:val="VerbatimChar"/>
+        </w:rPr>
+        <w:t xml:space="preserve">reporte_diseno_sirocco.pdf</w:t>
+      </w:r>
+    </w:p>
+    <w:p>
+      <w:pPr>
+        <w:pStyle w:val="FirstParagraph"/>
+      </w:pPr>
+      <w:r>
+        <w:t xml:space="preserve">Compilación A4 de 5 páginas. Es una memoria breve de revisión V1.</w:t>
+      </w:r>
+    </w:p>
+    <w:bookmarkEnd w:id="169"/>
+    <w:bookmarkStart w:id="170" w:name="assetssirocco_fan_renderjpg"/>
+    <w:p>
+      <w:pPr>
+        <w:pStyle w:val="Heading3"/>
+      </w:pPr>
+      <w:r>
+        <w:rPr>
+          <w:rStyle w:val="VerbatimChar"/>
+        </w:rPr>
+        <w:t xml:space="preserve">assets/sirocco_fan_render.jpg</w:t>
+      </w:r>
+    </w:p>
+    <w:p>
+      <w:pPr>
+        <w:pStyle w:val="FirstParagraph"/>
+      </w:pPr>
+      <w:r>
+        <w:t xml:space="preserve">Imagen utilizada en materiales visuales.</w:t>
+      </w:r>
+    </w:p>
+    <w:bookmarkEnd w:id="170"/>
+    <w:bookmarkEnd w:id="171"/>
+    <w:bookmarkStart w:id="172" w:name="ecuaciones-incluidas"/>
+    <w:p>
+      <w:pPr>
+        <w:pStyle w:val="Heading2"/>
+      </w:pPr>
+      <w:r>
         <w:t xml:space="preserve">Ecuaciones incluidas</w:t>
       </w:r>
     </w:p>
@@ -11247,8 +11475,8 @@
         <w:t xml:space="preserve">Δp_E = ρ U2 C_u2</w:t>
       </w:r>
     </w:p>
-    <w:bookmarkEnd w:id="167"/>
-    <w:bookmarkStart w:id="168" w:name="compilación"/>
+    <w:bookmarkEnd w:id="172"/>
+    <w:bookmarkStart w:id="173" w:name="compilación"/>
     <w:p>
       <w:pPr>
         <w:pStyle w:val="Heading2"/>
@@ -11305,8 +11533,8 @@
         <w:t xml:space="preserve">La segunda ejecución actualiza el índice y las referencias internas.</w:t>
       </w:r>
     </w:p>
-    <w:bookmarkEnd w:id="168"/>
-    <w:bookmarkStart w:id="169" w:name="relación-con-el-informe-principal"/>
+    <w:bookmarkEnd w:id="173"/>
+    <w:bookmarkStart w:id="174" w:name="relación-con-el-informe-principal"/>
     <w:p>
       <w:pPr>
         <w:pStyle w:val="Heading2"/>
@@ -11347,9 +11575,9 @@
         <w:t xml:space="preserve">alternativa editable.</w:t>
       </w:r>
     </w:p>
-    <w:bookmarkEnd w:id="169"/>
-    <w:bookmarkEnd w:id="170"/>
-    <w:bookmarkStart w:id="180" w:name="documentación-de-presentacion"/>
+    <w:bookmarkEnd w:id="174"/>
+    <w:bookmarkEnd w:id="175"/>
+    <w:bookmarkStart w:id="185" w:name="documentación-de-presentacion"/>
     <w:p>
       <w:pPr>
         <w:pStyle w:val="Heading1"/>
@@ -11367,7 +11595,7 @@
         <w:t xml:space="preserve">presentacion</w:t>
       </w:r>
     </w:p>
-    <w:bookmarkStart w:id="171" w:name="propósito-13"/>
+    <w:bookmarkStart w:id="176" w:name="propósito-13"/>
     <w:p>
       <w:pPr>
         <w:pStyle w:val="Heading2"/>
@@ -11390,8 +11618,8 @@
         <w:t xml:space="preserve">archivo PowerPoint generado con Python.</w:t>
       </w:r>
     </w:p>
-    <w:bookmarkEnd w:id="171"/>
-    <w:bookmarkStart w:id="174" w:name="presentación-web"/>
+    <w:bookmarkEnd w:id="176"/>
+    <w:bookmarkStart w:id="179" w:name="presentación-web"/>
     <w:p>
       <w:pPr>
         <w:pStyle w:val="Heading2"/>
@@ -11400,7 +11628,7 @@
         <w:t xml:space="preserve">Presentación web</w:t>
       </w:r>
     </w:p>
-    <w:bookmarkStart w:id="172" w:name="archivos-6"/>
+    <w:bookmarkStart w:id="177" w:name="archivos-7"/>
     <w:p>
       <w:pPr>
         <w:pStyle w:val="Heading3"/>
@@ -11463,8 +11691,8 @@
         <w:t xml:space="preserve">: navegación, cálculo interactivo y dibujo SVG.</w:t>
       </w:r>
     </w:p>
-    <w:bookmarkEnd w:id="172"/>
-    <w:bookmarkStart w:id="173" w:name="diapositivas"/>
+    <w:bookmarkEnd w:id="177"/>
+    <w:bookmarkStart w:id="178" w:name="diapositivas"/>
     <w:p>
       <w:pPr>
         <w:pStyle w:val="Heading3"/>
@@ -11610,9 +11838,9 @@
         <w:t xml:space="preserve">, no el cálculo del navegador.</w:t>
       </w:r>
     </w:p>
-    <w:bookmarkEnd w:id="173"/>
-    <w:bookmarkEnd w:id="174"/>
-    <w:bookmarkStart w:id="177" w:name="powerpoint"/>
+    <w:bookmarkEnd w:id="178"/>
+    <w:bookmarkEnd w:id="179"/>
+    <w:bookmarkStart w:id="182" w:name="powerpoint"/>
     <w:p>
       <w:pPr>
         <w:pStyle w:val="Heading2"/>
@@ -11621,7 +11849,7 @@
         <w:t xml:space="preserve">PowerPoint</w:t>
       </w:r>
     </w:p>
-    <w:bookmarkStart w:id="175" w:name="presentacion_siroccopptx"/>
+    <w:bookmarkStart w:id="180" w:name="presentacion_siroccopptx"/>
     <w:p>
       <w:pPr>
         <w:pStyle w:val="Heading3"/>
@@ -11641,8 +11869,8 @@
         <w:t xml:space="preserve">Presentación de 7 diapositivas en formato panorámico 16:9.</w:t>
       </w:r>
     </w:p>
-    <w:bookmarkEnd w:id="175"/>
-    <w:bookmarkStart w:id="176" w:name="generate_pptxpy"/>
+    <w:bookmarkEnd w:id="180"/>
+    <w:bookmarkStart w:id="181" w:name="generate_pptxpy"/>
     <w:p>
       <w:pPr>
         <w:pStyle w:val="Heading3"/>
@@ -11735,9 +11963,9 @@
         <w:t xml:space="preserve"> generate_pptx.py</w:t>
       </w:r>
     </w:p>
-    <w:bookmarkEnd w:id="176"/>
-    <w:bookmarkEnd w:id="177"/>
-    <w:bookmarkStart w:id="178" w:name="recursos"/>
+    <w:bookmarkEnd w:id="181"/>
+    <w:bookmarkEnd w:id="182"/>
+    <w:bookmarkStart w:id="183" w:name="recursos"/>
     <w:p>
       <w:pPr>
         <w:pStyle w:val="Heading2"/>
@@ -11782,8 +12010,8 @@
         <w:t xml:space="preserve">: marcador de la carpeta de recursos.</w:t>
       </w:r>
     </w:p>
-    <w:bookmarkEnd w:id="178"/>
-    <w:bookmarkStart w:id="179" w:name="revisión-antes-de-exponer"/>
+    <w:bookmarkEnd w:id="183"/>
+    <w:bookmarkStart w:id="184" w:name="revisión-antes-de-exponer"/>
     <w:p>
       <w:pPr>
         <w:pStyle w:val="Heading2"/>
@@ -11882,8 +12110,8 @@
         <w:t xml:space="preserve">Mantener visible la necesidad de CFD y ensayo.</w:t>
       </w:r>
     </w:p>
-    <w:bookmarkEnd w:id="179"/>
-    <w:bookmarkEnd w:id="180"/>
+    <w:bookmarkEnd w:id="184"/>
+    <w:bookmarkEnd w:id="185"/>
     <w:sectPr/>
   </w:body>
 </w:document>

</xml_diff>